<commit_message>
docs(artigo): cite six harness studies from major labs
Adds Grace et al. (Anthropic), Merrill et al. (Terminal-Bench, ICLR 2026), DeepSeek-AI (DeepSeek-V4.1-Flash), Furgale et al. (NVIDIA NOOA), Lindenbauer et al. (TUM/JetBrains) and Wong et al. (Meta/Harvard). Each number was checked against the primary text. Two of them measure OpenCode and Pi with the same model, and NOOA shows Pi spending more tokens per task through more calls, which section 4 now cites. Also adds the advisor's e-mail to footnote 2. Word: 9 pages; 20 entries, 20 cited.
</commit_message>
<xml_diff>
--- a/dist/artigo-cientifico.docx
+++ b/dist/artigo-cientifico.docx
@@ -1089,7 +1089,39 @@
           <w:sz w:val="24"/>
           <w:szCs w:val="24"/>
         </w:rPr>
-        <w:t xml:space="preserve">Só esse conjunto varia entre os </w:t>
+        <w:t xml:space="preserve">Avaliar um agente é avaliar o </w:t>
+      </w:r>
+      <w:r>
+        <w:rPr>
+          <w:i/>
+          <w:iCs/>
+          <w:sz w:val="24"/>
+          <w:szCs w:val="24"/>
+        </w:rPr>
+        <w:t xml:space="preserve">harness</w:t>
+      </w:r>
+      <w:r>
+        <w:rPr>
+          <w:sz w:val="24"/>
+          <w:szCs w:val="24"/>
+        </w:rPr>
+        <w:t xml:space="preserve"> e o modelo juntos (Grace </w:t>
+      </w:r>
+      <w:r>
+        <w:rPr>
+          <w:i/>
+          <w:iCs/>
+          <w:sz w:val="24"/>
+          <w:szCs w:val="24"/>
+        </w:rPr>
+        <w:t xml:space="preserve">et al.</w:t>
+      </w:r>
+      <w:r>
+        <w:rPr>
+          <w:sz w:val="24"/>
+          <w:szCs w:val="24"/>
+        </w:rPr>
+        <w:t xml:space="preserve">, 2026). Por isso só esse conjunto varia entre os </w:t>
       </w:r>
       <w:r>
         <w:rPr>
@@ -1231,7 +1263,7 @@
           <w:sz w:val="24"/>
           <w:szCs w:val="24"/>
         </w:rPr>
-        <w:t xml:space="preserve"> sobre a taxa de sucesso ficou dentro de ±2%, enquanto o Claude Code custou, em média, cerca de 2,0 vezes o Pi. Como as fontes divergem sobre o sucesso, este trabalho mede sucesso e custo juntos.</w:t>
+        <w:t xml:space="preserve"> sobre a taxa de sucesso ficou dentro de ±2%, enquanto o Claude Code custou, em média, cerca de 2,0 vezes o Pi.</w:t>
       </w:r>
     </w:p>
     <w:p>
@@ -1245,6 +1277,68 @@
           <w:sz w:val="24"/>
           <w:szCs w:val="24"/>
         </w:rPr>
+        <w:t xml:space="preserve">No Terminal-Bench 2.0, com 89 tarefas e ao menos cinco execuções por par, o Gemini 2.5 Pro resolveu 32,6% das tarefas no Terminus 2 e 15,7% no OpenHands, mas os autores concluem que o modelo costuma pesar mais que o </w:t>
+      </w:r>
+      <w:r>
+        <w:rPr>
+          <w:i/>
+          <w:iCs/>
+          <w:sz w:val="24"/>
+          <w:szCs w:val="24"/>
+        </w:rPr>
+        <w:t xml:space="preserve">harness</w:t>
+      </w:r>
+      <w:r>
+        <w:rPr>
+          <w:sz w:val="24"/>
+          <w:szCs w:val="24"/>
+        </w:rPr>
+        <w:t xml:space="preserve"> (Merrill </w:t>
+      </w:r>
+      <w:r>
+        <w:rPr>
+          <w:i/>
+          <w:iCs/>
+          <w:sz w:val="24"/>
+          <w:szCs w:val="24"/>
+        </w:rPr>
+        <w:t xml:space="preserve">et al.</w:t>
+      </w:r>
+      <w:r>
+        <w:rPr>
+          <w:sz w:val="24"/>
+          <w:szCs w:val="24"/>
+        </w:rPr>
+        <w:t xml:space="preserve">, 2026). Entre o OpenCode e o Pi, o DeepSeek-AI (2026) obteve 85,0% e 86,1% no Terminal-Bench v2.1 com o DeepSeek-V4.1-Flash, e Furgale </w:t>
+      </w:r>
+      <w:r>
+        <w:rPr>
+          <w:i/>
+          <w:iCs/>
+          <w:sz w:val="24"/>
+          <w:szCs w:val="24"/>
+        </w:rPr>
+        <w:t xml:space="preserve">et al.</w:t>
+      </w:r>
+      <w:r>
+        <w:rPr>
+          <w:sz w:val="24"/>
+          <w:szCs w:val="24"/>
+        </w:rPr>
+        <w:t xml:space="preserve"> (2026), 52,8% e 75,3% no Terminal-Bench 2.0 com o GPT-5.5. Como as fontes divergem sobre o sucesso, este trabalho mede sucesso e custo juntos.</w:t>
+      </w:r>
+    </w:p>
+    <w:p>
+      <w:pPr>
+        <w:spacing w:before="0" w:after="0" w:line="360" w:lineRule="auto"/>
+        <w:ind w:left="0" w:firstLine="709"/>
+        <w:jc w:val="both"/>
+      </w:pPr>
+      <w:r>
+        <w:rPr>
+          <w:sz w:val="24"/>
+          <w:szCs w:val="24"/>
+        </w:rPr>
         <w:t xml:space="preserve">A primeira pendência é saber de onde vem a diferença de custo. Para Pan </w:t>
       </w:r>
       <w:r>
@@ -1293,7 +1387,53 @@
           <w:sz w:val="24"/>
           <w:szCs w:val="24"/>
         </w:rPr>
-        <w:t xml:space="preserve"> (2026) apontam o resto da conversa. Mudando só a execução das ações, a compactação de contexto, o tratamento das observações e a leitura delegada, cortaram de 44,7% a 49,0% dos tokens em relação ao Pi e mantiveram de 93,7% a 94,3% da pontuação dele. Ning </w:t>
+        <w:t xml:space="preserve"> (2026) apontam o resto da conversa. Mudando só a execução das ações, a compactação de contexto, o tratamento das observações e a leitura delegada, cortaram de 44,7% a 49,0% dos tokens em relação ao Pi e mantiveram de 93,7% a 94,3% da pontuação dele.</w:t>
+      </w:r>
+    </w:p>
+    <w:p>
+      <w:pPr>
+        <w:spacing w:before="0" w:after="0" w:line="360" w:lineRule="auto"/>
+        <w:ind w:left="0" w:firstLine="709"/>
+        <w:jc w:val="both"/>
+      </w:pPr>
+      <w:r>
+        <w:rPr>
+          <w:sz w:val="24"/>
+          <w:szCs w:val="24"/>
+        </w:rPr>
+        <w:t xml:space="preserve">O gerenciamento de contexto, sozinho, também muda custo e sucesso com o modelo fixo. No SWE-agent com o Qwen3-Coder 480B, mascarar observações antigas baixou o custo por tarefa de US$ 1,29 para US$ 0,61 nas 500 tarefas do SWE-bench Verified (Lindenbauer </w:t>
+      </w:r>
+      <w:r>
+        <w:rPr>
+          <w:i/>
+          <w:iCs/>
+          <w:sz w:val="24"/>
+          <w:szCs w:val="24"/>
+        </w:rPr>
+        <w:t xml:space="preserve">et al.</w:t>
+      </w:r>
+      <w:r>
+        <w:rPr>
+          <w:sz w:val="24"/>
+          <w:szCs w:val="24"/>
+        </w:rPr>
+        <w:t xml:space="preserve">, 2025). Com o Claude 4 Sonnet, o gerenciamento de contexto elevou a resolução de 42,0% para 48,6% em 100 tarefas do SWE-Bench Pro (Wong </w:t>
+      </w:r>
+      <w:r>
+        <w:rPr>
+          <w:i/>
+          <w:iCs/>
+          <w:sz w:val="24"/>
+          <w:szCs w:val="24"/>
+        </w:rPr>
+        <w:t xml:space="preserve">et al.</w:t>
+      </w:r>
+      <w:r>
+        <w:rPr>
+          <w:sz w:val="24"/>
+          <w:szCs w:val="24"/>
+        </w:rPr>
+        <w:t xml:space="preserve">, 2025). Ning </w:t>
       </w:r>
       <w:r>
         <w:rPr>
@@ -3099,7 +3239,23 @@
           <w:sz w:val="24"/>
           <w:szCs w:val="24"/>
         </w:rPr>
-        <w:t xml:space="preserve"> precisarem de números de passos parecidos, a carga fixa deve responder pela maior parte da diferença de tokens. Se o Pi precisar de muito mais passos, a vantagem inicial pode se perder.</w:t>
+        <w:t xml:space="preserve"> precisarem de números de passos parecidos, a carga fixa deve responder pela maior parte da diferença de tokens. Se o Pi precisar de muito mais passos, a vantagem inicial pode se perder. Furgale </w:t>
+      </w:r>
+      <w:r>
+        <w:rPr>
+          <w:i/>
+          <w:iCs/>
+          <w:sz w:val="24"/>
+          <w:szCs w:val="24"/>
+        </w:rPr>
+        <w:t xml:space="preserve">et al.</w:t>
+      </w:r>
+      <w:r>
+        <w:rPr>
+          <w:sz w:val="24"/>
+          <w:szCs w:val="24"/>
+        </w:rPr>
+        <w:t xml:space="preserve"> (2026) registraram esse caso no SWE-bench Verified com o GPT-5.5 (esforço xhigh). O Pi 0.72.1 fez 66 chamadas e gastou 2,2 milhões de tokens por tarefa para 78,2% de acerto, e o OpenCode 1.14.33, 1,3 milhão para 78,6%.</w:t>
       </w:r>
     </w:p>
     <w:p>
@@ -3379,7 +3535,7 @@
           <w:sz w:val="24"/>
           <w:szCs w:val="24"/>
         </w:rPr>
-        <w:t xml:space="preserve">EARENDIL. </w:t>
+        <w:t xml:space="preserve">DEEPSEEK-AI. </w:t>
       </w:r>
       <w:r>
         <w:rPr>
@@ -3388,14 +3544,30 @@
           <w:sz w:val="24"/>
           <w:szCs w:val="24"/>
         </w:rPr>
-        <w:t xml:space="preserve">Pi, minimal and performant</w:t>
-      </w:r>
-      <w:r>
-        <w:rPr>
-          <w:sz w:val="24"/>
-          <w:szCs w:val="24"/>
-        </w:rPr>
-        <w:t xml:space="preserve">. 2026. Publicação de blogue institucional. Disponível em: https://earendil.com/posts/pi-autoresearch-and-databricks/. Acesso em: 28 ago. 2026.</w:t>
+        <w:t xml:space="preserve">DeepSeek-V4.1-Flash</w:t>
+      </w:r>
+      <w:r>
+        <w:rPr>
+          <w:sz w:val="24"/>
+          <w:szCs w:val="24"/>
+        </w:rPr>
+        <w:t xml:space="preserve">: pushing the limits of KV cache compression. arXiv:2609.19969, 2026. </w:t>
+      </w:r>
+      <w:r>
+        <w:rPr>
+          <w:i/>
+          <w:iCs/>
+          <w:sz w:val="24"/>
+          <w:szCs w:val="24"/>
+        </w:rPr>
+        <w:t xml:space="preserve">Preprint</w:t>
+      </w:r>
+      <w:r>
+        <w:rPr>
+          <w:sz w:val="24"/>
+          <w:szCs w:val="24"/>
+        </w:rPr>
+        <w:t xml:space="preserve">, não revisado por pares. Disponível em: https://arxiv.org/abs/2609.19969. Acesso em: 22 out. 2026.</w:t>
       </w:r>
     </w:p>
     <w:p>
@@ -3409,7 +3581,7 @@
           <w:sz w:val="24"/>
           <w:szCs w:val="24"/>
         </w:rPr>
-        <w:t xml:space="preserve">KARPATHY, Andrej. </w:t>
+        <w:t xml:space="preserve">EARENDIL. </w:t>
       </w:r>
       <w:r>
         <w:rPr>
@@ -3418,14 +3590,14 @@
           <w:sz w:val="24"/>
           <w:szCs w:val="24"/>
         </w:rPr>
-        <w:t xml:space="preserve">LLM Wiki</w:t>
-      </w:r>
-      <w:r>
-        <w:rPr>
-          <w:sz w:val="24"/>
-          <w:szCs w:val="24"/>
-        </w:rPr>
-        <w:t xml:space="preserve">: a pattern for building personal knowledge bases using LLMs. 2026. Gist (GitHub). Disponível em: https://gist.github.com/karpathy/442a6bf555914893e9891c11519de94f. Acesso em: 14 set. 2026.</w:t>
+        <w:t xml:space="preserve">Pi, minimal and performant</w:t>
+      </w:r>
+      <w:r>
+        <w:rPr>
+          <w:sz w:val="24"/>
+          <w:szCs w:val="24"/>
+        </w:rPr>
+        <w:t xml:space="preserve">. 2026. Publicação de blogue institucional. Disponível em: https://earendil.com/posts/pi-autoresearch-and-databricks/. Acesso em: 28 ago. 2026.</w:t>
       </w:r>
     </w:p>
     <w:p>
@@ -3439,7 +3611,7 @@
           <w:sz w:val="24"/>
           <w:szCs w:val="24"/>
         </w:rPr>
-        <w:t xml:space="preserve">LIN, Jiahang </w:t>
+        <w:t xml:space="preserve">FURGALE, Paul </w:t>
       </w:r>
       <w:r>
         <w:rPr>
@@ -3464,14 +3636,14 @@
           <w:sz w:val="24"/>
           <w:szCs w:val="24"/>
         </w:rPr>
-        <w:t xml:space="preserve">Agentic harness engineering</w:t>
-      </w:r>
-      <w:r>
-        <w:rPr>
-          <w:sz w:val="24"/>
-          <w:szCs w:val="24"/>
-        </w:rPr>
-        <w:t xml:space="preserve">: observability-driven automatic evolution of coding-agent harnesses. arXiv:2604.25850, 2026. </w:t>
+        <w:t xml:space="preserve">NVIDIA-labs OO Agents</w:t>
+      </w:r>
+      <w:r>
+        <w:rPr>
+          <w:sz w:val="24"/>
+          <w:szCs w:val="24"/>
+        </w:rPr>
+        <w:t xml:space="preserve">: native Python object-oriented agents. arXiv:2607.20709, 2026. </w:t>
       </w:r>
       <w:r>
         <w:rPr>
@@ -3487,7 +3659,7 @@
           <w:sz w:val="24"/>
           <w:szCs w:val="24"/>
         </w:rPr>
-        <w:t xml:space="preserve">, não revisado por pares. Disponível em: https://arxiv.org/abs/2604.25850. Acesso em: 28 ago. 2026.</w:t>
+        <w:t xml:space="preserve">, não revisado por pares. Disponível em: https://arxiv.org/abs/2607.20709. Acesso em: 22 out. 2026.</w:t>
       </w:r>
     </w:p>
     <w:p>
@@ -3501,7 +3673,7 @@
           <w:sz w:val="24"/>
           <w:szCs w:val="24"/>
         </w:rPr>
-        <w:t xml:space="preserve">LIU, Haozhe </w:t>
+        <w:t xml:space="preserve">GRACE, Mikaela </w:t>
       </w:r>
       <w:r>
         <w:rPr>
@@ -3526,30 +3698,14 @@
           <w:sz w:val="24"/>
           <w:szCs w:val="24"/>
         </w:rPr>
-        <w:t xml:space="preserve">SoL-Pi</w:t>
-      </w:r>
-      <w:r>
-        <w:rPr>
-          <w:sz w:val="24"/>
-          <w:szCs w:val="24"/>
-        </w:rPr>
-        <w:t xml:space="preserve">: recursively scaling auto-research loops for efficient agent harness. arXiv:2609.20519, 2026. </w:t>
-      </w:r>
-      <w:r>
-        <w:rPr>
-          <w:i/>
-          <w:iCs/>
-          <w:sz w:val="24"/>
-          <w:szCs w:val="24"/>
-        </w:rPr>
-        <w:t xml:space="preserve">Preprint</w:t>
-      </w:r>
-      <w:r>
-        <w:rPr>
-          <w:sz w:val="24"/>
-          <w:szCs w:val="24"/>
-        </w:rPr>
-        <w:t xml:space="preserve">, não revisado por pares. Disponível em: https://arxiv.org/abs/2609.20519. Acesso em: 23 set. 2026.</w:t>
+        <w:t xml:space="preserve">Demystifying evals for AI agents</w:t>
+      </w:r>
+      <w:r>
+        <w:rPr>
+          <w:sz w:val="24"/>
+          <w:szCs w:val="24"/>
+        </w:rPr>
+        <w:t xml:space="preserve">. 2026. Publicação de blogue de engenharia (Anthropic), não revisada por pares. Disponível em: https://www.anthropic.com/engineering/demystifying-evals-for-ai-agents. Acesso em: 22 out. 2026.</w:t>
       </w:r>
     </w:p>
     <w:p>
@@ -3563,7 +3719,7 @@
           <w:sz w:val="24"/>
           <w:szCs w:val="24"/>
         </w:rPr>
-        <w:t xml:space="preserve">MILLER, Evan. </w:t>
+        <w:t xml:space="preserve">KARPATHY, Andrej. </w:t>
       </w:r>
       <w:r>
         <w:rPr>
@@ -3572,30 +3728,14 @@
           <w:sz w:val="24"/>
           <w:szCs w:val="24"/>
         </w:rPr>
-        <w:t xml:space="preserve">Adding error bars to evals</w:t>
-      </w:r>
-      <w:r>
-        <w:rPr>
-          <w:sz w:val="24"/>
-          <w:szCs w:val="24"/>
-        </w:rPr>
-        <w:t xml:space="preserve">: a statistical approach to language model evaluations. arXiv:2411.00640, 2024. </w:t>
-      </w:r>
-      <w:r>
-        <w:rPr>
-          <w:i/>
-          <w:iCs/>
-          <w:sz w:val="24"/>
-          <w:szCs w:val="24"/>
-        </w:rPr>
-        <w:t xml:space="preserve">Preprint</w:t>
-      </w:r>
-      <w:r>
-        <w:rPr>
-          <w:sz w:val="24"/>
-          <w:szCs w:val="24"/>
-        </w:rPr>
-        <w:t xml:space="preserve">, não revisado por pares. Disponível em: https://arxiv.org/abs/2411.00640. Acesso em: 28 ago. 2026.</w:t>
+        <w:t xml:space="preserve">LLM Wiki</w:t>
+      </w:r>
+      <w:r>
+        <w:rPr>
+          <w:sz w:val="24"/>
+          <w:szCs w:val="24"/>
+        </w:rPr>
+        <w:t xml:space="preserve">: a pattern for building personal knowledge bases using LLMs. 2026. Gist (GitHub). Disponível em: https://gist.github.com/karpathy/442a6bf555914893e9891c11519de94f. Acesso em: 14 set. 2026.</w:t>
       </w:r>
     </w:p>
     <w:p>
@@ -3609,7 +3749,7 @@
           <w:sz w:val="24"/>
           <w:szCs w:val="24"/>
         </w:rPr>
-        <w:t xml:space="preserve">NING, Xuying </w:t>
+        <w:t xml:space="preserve">LIN, Jiahang </w:t>
       </w:r>
       <w:r>
         <w:rPr>
@@ -3634,14 +3774,14 @@
           <w:sz w:val="24"/>
           <w:szCs w:val="24"/>
         </w:rPr>
-        <w:t xml:space="preserve">Code as agent harness</w:t>
-      </w:r>
-      <w:r>
-        <w:rPr>
-          <w:sz w:val="24"/>
-          <w:szCs w:val="24"/>
-        </w:rPr>
-        <w:t xml:space="preserve">. arXiv:2605.18747, 2026. </w:t>
+        <w:t xml:space="preserve">Agentic harness engineering</w:t>
+      </w:r>
+      <w:r>
+        <w:rPr>
+          <w:sz w:val="24"/>
+          <w:szCs w:val="24"/>
+        </w:rPr>
+        <w:t xml:space="preserve">: observability-driven automatic evolution of coding-agent harnesses. arXiv:2604.25850, 2026. </w:t>
       </w:r>
       <w:r>
         <w:rPr>
@@ -3657,7 +3797,7 @@
           <w:sz w:val="24"/>
           <w:szCs w:val="24"/>
         </w:rPr>
-        <w:t xml:space="preserve">, não revisado por pares. Disponível em: https://arxiv.org/abs/2605.18747. Acesso em: 28 ago. 2026.</w:t>
+        <w:t xml:space="preserve">, não revisado por pares. Disponível em: https://arxiv.org/abs/2604.25850. Acesso em: 28 ago. 2026.</w:t>
       </w:r>
     </w:p>
     <w:p>
@@ -3671,7 +3811,23 @@
           <w:sz w:val="24"/>
           <w:szCs w:val="24"/>
         </w:rPr>
-        <w:t xml:space="preserve">OPENCODE. </w:t>
+        <w:t xml:space="preserve">LINDENBAUER, Tobias </w:t>
+      </w:r>
+      <w:r>
+        <w:rPr>
+          <w:i/>
+          <w:iCs/>
+          <w:sz w:val="24"/>
+          <w:szCs w:val="24"/>
+        </w:rPr>
+        <w:t xml:space="preserve">et al.</w:t>
+      </w:r>
+      <w:r>
+        <w:rPr>
+          <w:sz w:val="24"/>
+          <w:szCs w:val="24"/>
+        </w:rPr>
+        <w:t xml:space="preserve"> </w:t>
       </w:r>
       <w:r>
         <w:rPr>
@@ -3680,14 +3836,30 @@
           <w:sz w:val="24"/>
           <w:szCs w:val="24"/>
         </w:rPr>
-        <w:t xml:space="preserve">OpenCode</w:t>
-      </w:r>
-      <w:r>
-        <w:rPr>
-          <w:sz w:val="24"/>
-          <w:szCs w:val="24"/>
-        </w:rPr>
-        <w:t xml:space="preserve">: the open source coding agent. 2026a. Repositório de código. Disponível em: https://github.com/anomalyco/opencode. Acesso em: 14 set. 2026.</w:t>
+        <w:t xml:space="preserve">The complexity trap</w:t>
+      </w:r>
+      <w:r>
+        <w:rPr>
+          <w:sz w:val="24"/>
+          <w:szCs w:val="24"/>
+        </w:rPr>
+        <w:t xml:space="preserve">: simple observation masking is as efficient as LLM summarization for agent context management. arXiv:2508.21433, 2025. </w:t>
+      </w:r>
+      <w:r>
+        <w:rPr>
+          <w:i/>
+          <w:iCs/>
+          <w:sz w:val="24"/>
+          <w:szCs w:val="24"/>
+        </w:rPr>
+        <w:t xml:space="preserve">Preprint</w:t>
+      </w:r>
+      <w:r>
+        <w:rPr>
+          <w:sz w:val="24"/>
+          <w:szCs w:val="24"/>
+        </w:rPr>
+        <w:t xml:space="preserve">, não revisado por pares. Disponível em: https://arxiv.org/abs/2508.21433. Acesso em: 22 out. 2026.</w:t>
       </w:r>
     </w:p>
     <w:p>
@@ -3701,7 +3873,23 @@
           <w:sz w:val="24"/>
           <w:szCs w:val="24"/>
         </w:rPr>
-        <w:t xml:space="preserve">OPENCODE. </w:t>
+        <w:t xml:space="preserve">LIU, Haozhe </w:t>
+      </w:r>
+      <w:r>
+        <w:rPr>
+          <w:i/>
+          <w:iCs/>
+          <w:sz w:val="24"/>
+          <w:szCs w:val="24"/>
+        </w:rPr>
+        <w:t xml:space="preserve">et al.</w:t>
+      </w:r>
+      <w:r>
+        <w:rPr>
+          <w:sz w:val="24"/>
+          <w:szCs w:val="24"/>
+        </w:rPr>
+        <w:t xml:space="preserve"> </w:t>
       </w:r>
       <w:r>
         <w:rPr>
@@ -3710,14 +3898,30 @@
           <w:sz w:val="24"/>
           <w:szCs w:val="24"/>
         </w:rPr>
-        <w:t xml:space="preserve">Zen</w:t>
-      </w:r>
-      <w:r>
-        <w:rPr>
-          <w:sz w:val="24"/>
-          <w:szCs w:val="24"/>
-        </w:rPr>
-        <w:t xml:space="preserve">. 2026b. Documentação do produto. Disponível em: https://opencode.ai/docs/zen/. Acesso em: 28 ago. 2026.</w:t>
+        <w:t xml:space="preserve">SoL-Pi</w:t>
+      </w:r>
+      <w:r>
+        <w:rPr>
+          <w:sz w:val="24"/>
+          <w:szCs w:val="24"/>
+        </w:rPr>
+        <w:t xml:space="preserve">: recursively scaling auto-research loops for efficient agent harness. arXiv:2609.20519, 2026. </w:t>
+      </w:r>
+      <w:r>
+        <w:rPr>
+          <w:i/>
+          <w:iCs/>
+          <w:sz w:val="24"/>
+          <w:szCs w:val="24"/>
+        </w:rPr>
+        <w:t xml:space="preserve">Preprint</w:t>
+      </w:r>
+      <w:r>
+        <w:rPr>
+          <w:sz w:val="24"/>
+          <w:szCs w:val="24"/>
+        </w:rPr>
+        <w:t xml:space="preserve">, não revisado por pares. Disponível em: https://arxiv.org/abs/2609.20519. Acesso em: 23 set. 2026.</w:t>
       </w:r>
     </w:p>
     <w:p>
@@ -3731,7 +3935,7 @@
           <w:sz w:val="24"/>
           <w:szCs w:val="24"/>
         </w:rPr>
-        <w:t xml:space="preserve">PAN, Melissa Z. </w:t>
+        <w:t xml:space="preserve">MERRILL, Mike A. </w:t>
       </w:r>
       <w:r>
         <w:rPr>
@@ -3747,7 +3951,7 @@
           <w:sz w:val="24"/>
           <w:szCs w:val="24"/>
         </w:rPr>
-        <w:t xml:space="preserve"> </w:t>
+        <w:t xml:space="preserve"> Terminal-Bench: benchmarking agents on hard, realistic tasks in command line interfaces. In: INTERNATIONAL CONFERENCE ON LEARNING REPRESENTATIONS, 2026. </w:t>
       </w:r>
       <w:r>
         <w:rPr>
@@ -3756,6 +3960,252 @@
           <w:sz w:val="24"/>
           <w:szCs w:val="24"/>
         </w:rPr>
+        <w:t xml:space="preserve">Proceedings</w:t>
+      </w:r>
+      <w:r>
+        <w:rPr>
+          <w:sz w:val="24"/>
+          <w:szCs w:val="24"/>
+        </w:rPr>
+        <w:t xml:space="preserve"> [...]. [</w:t>
+      </w:r>
+      <w:r>
+        <w:rPr>
+          <w:i/>
+          <w:iCs/>
+          <w:sz w:val="24"/>
+          <w:szCs w:val="24"/>
+        </w:rPr>
+        <w:t xml:space="preserve">S. l.</w:t>
+      </w:r>
+      <w:r>
+        <w:rPr>
+          <w:sz w:val="24"/>
+          <w:szCs w:val="24"/>
+        </w:rPr>
+        <w:t xml:space="preserve">: </w:t>
+      </w:r>
+      <w:r>
+        <w:rPr>
+          <w:i/>
+          <w:iCs/>
+          <w:sz w:val="24"/>
+          <w:szCs w:val="24"/>
+        </w:rPr>
+        <w:t xml:space="preserve">s. n.</w:t>
+      </w:r>
+      <w:r>
+        <w:rPr>
+          <w:sz w:val="24"/>
+          <w:szCs w:val="24"/>
+        </w:rPr>
+        <w:t xml:space="preserve">], 2026. Disponível em: https://proceedings.iclr.cc/paper_files/paper/2026/hash/444a3737adaee10d86ad2ef5f74468e6-Abstract-Conference.html. Acesso em: 22 out. 2026.</w:t>
+      </w:r>
+    </w:p>
+    <w:p>
+      <w:pPr>
+        <w:spacing w:before="120" w:after="120" w:line="240" w:lineRule="auto"/>
+        <w:ind w:left="0" w:firstLine="0"/>
+        <w:jc w:val="left"/>
+      </w:pPr>
+      <w:r>
+        <w:rPr>
+          <w:sz w:val="24"/>
+          <w:szCs w:val="24"/>
+        </w:rPr>
+        <w:t xml:space="preserve">MILLER, Evan. </w:t>
+      </w:r>
+      <w:r>
+        <w:rPr>
+          <w:b/>
+          <w:bCs/>
+          <w:sz w:val="24"/>
+          <w:szCs w:val="24"/>
+        </w:rPr>
+        <w:t xml:space="preserve">Adding error bars to evals</w:t>
+      </w:r>
+      <w:r>
+        <w:rPr>
+          <w:sz w:val="24"/>
+          <w:szCs w:val="24"/>
+        </w:rPr>
+        <w:t xml:space="preserve">: a statistical approach to language model evaluations. arXiv:2411.00640, 2024. </w:t>
+      </w:r>
+      <w:r>
+        <w:rPr>
+          <w:i/>
+          <w:iCs/>
+          <w:sz w:val="24"/>
+          <w:szCs w:val="24"/>
+        </w:rPr>
+        <w:t xml:space="preserve">Preprint</w:t>
+      </w:r>
+      <w:r>
+        <w:rPr>
+          <w:sz w:val="24"/>
+          <w:szCs w:val="24"/>
+        </w:rPr>
+        <w:t xml:space="preserve">, não revisado por pares. Disponível em: https://arxiv.org/abs/2411.00640. Acesso em: 28 ago. 2026.</w:t>
+      </w:r>
+    </w:p>
+    <w:p>
+      <w:pPr>
+        <w:spacing w:before="120" w:after="120" w:line="240" w:lineRule="auto"/>
+        <w:ind w:left="0" w:firstLine="0"/>
+        <w:jc w:val="left"/>
+      </w:pPr>
+      <w:r>
+        <w:rPr>
+          <w:sz w:val="24"/>
+          <w:szCs w:val="24"/>
+        </w:rPr>
+        <w:t xml:space="preserve">NING, Xuying </w:t>
+      </w:r>
+      <w:r>
+        <w:rPr>
+          <w:i/>
+          <w:iCs/>
+          <w:sz w:val="24"/>
+          <w:szCs w:val="24"/>
+        </w:rPr>
+        <w:t xml:space="preserve">et al.</w:t>
+      </w:r>
+      <w:r>
+        <w:rPr>
+          <w:sz w:val="24"/>
+          <w:szCs w:val="24"/>
+        </w:rPr>
+        <w:t xml:space="preserve"> </w:t>
+      </w:r>
+      <w:r>
+        <w:rPr>
+          <w:b/>
+          <w:bCs/>
+          <w:sz w:val="24"/>
+          <w:szCs w:val="24"/>
+        </w:rPr>
+        <w:t xml:space="preserve">Code as agent harness</w:t>
+      </w:r>
+      <w:r>
+        <w:rPr>
+          <w:sz w:val="24"/>
+          <w:szCs w:val="24"/>
+        </w:rPr>
+        <w:t xml:space="preserve">. arXiv:2605.18747, 2026. </w:t>
+      </w:r>
+      <w:r>
+        <w:rPr>
+          <w:i/>
+          <w:iCs/>
+          <w:sz w:val="24"/>
+          <w:szCs w:val="24"/>
+        </w:rPr>
+        <w:t xml:space="preserve">Preprint</w:t>
+      </w:r>
+      <w:r>
+        <w:rPr>
+          <w:sz w:val="24"/>
+          <w:szCs w:val="24"/>
+        </w:rPr>
+        <w:t xml:space="preserve">, não revisado por pares. Disponível em: https://arxiv.org/abs/2605.18747. Acesso em: 28 ago. 2026.</w:t>
+      </w:r>
+    </w:p>
+    <w:p>
+      <w:pPr>
+        <w:spacing w:before="120" w:after="120" w:line="240" w:lineRule="auto"/>
+        <w:ind w:left="0" w:firstLine="0"/>
+        <w:jc w:val="left"/>
+      </w:pPr>
+      <w:r>
+        <w:rPr>
+          <w:sz w:val="24"/>
+          <w:szCs w:val="24"/>
+        </w:rPr>
+        <w:t xml:space="preserve">OPENCODE. </w:t>
+      </w:r>
+      <w:r>
+        <w:rPr>
+          <w:b/>
+          <w:bCs/>
+          <w:sz w:val="24"/>
+          <w:szCs w:val="24"/>
+        </w:rPr>
+        <w:t xml:space="preserve">OpenCode</w:t>
+      </w:r>
+      <w:r>
+        <w:rPr>
+          <w:sz w:val="24"/>
+          <w:szCs w:val="24"/>
+        </w:rPr>
+        <w:t xml:space="preserve">: the open source coding agent. 2026a. Repositório de código. Disponível em: https://github.com/anomalyco/opencode. Acesso em: 14 set. 2026.</w:t>
+      </w:r>
+    </w:p>
+    <w:p>
+      <w:pPr>
+        <w:spacing w:before="120" w:after="120" w:line="240" w:lineRule="auto"/>
+        <w:ind w:left="0" w:firstLine="0"/>
+        <w:jc w:val="left"/>
+      </w:pPr>
+      <w:r>
+        <w:rPr>
+          <w:sz w:val="24"/>
+          <w:szCs w:val="24"/>
+        </w:rPr>
+        <w:t xml:space="preserve">OPENCODE. </w:t>
+      </w:r>
+      <w:r>
+        <w:rPr>
+          <w:b/>
+          <w:bCs/>
+          <w:sz w:val="24"/>
+          <w:szCs w:val="24"/>
+        </w:rPr>
+        <w:t xml:space="preserve">Zen</w:t>
+      </w:r>
+      <w:r>
+        <w:rPr>
+          <w:sz w:val="24"/>
+          <w:szCs w:val="24"/>
+        </w:rPr>
+        <w:t xml:space="preserve">. 2026b. Documentação do produto. Disponível em: https://opencode.ai/docs/zen/. Acesso em: 28 ago. 2026.</w:t>
+      </w:r>
+    </w:p>
+    <w:p>
+      <w:pPr>
+        <w:spacing w:before="120" w:after="120" w:line="240" w:lineRule="auto"/>
+        <w:ind w:left="0" w:firstLine="0"/>
+        <w:jc w:val="left"/>
+      </w:pPr>
+      <w:r>
+        <w:rPr>
+          <w:sz w:val="24"/>
+          <w:szCs w:val="24"/>
+        </w:rPr>
+        <w:t xml:space="preserve">PAN, Melissa Z. </w:t>
+      </w:r>
+      <w:r>
+        <w:rPr>
+          <w:i/>
+          <w:iCs/>
+          <w:sz w:val="24"/>
+          <w:szCs w:val="24"/>
+        </w:rPr>
+        <w:t xml:space="preserve">et al.</w:t>
+      </w:r>
+      <w:r>
+        <w:rPr>
+          <w:sz w:val="24"/>
+          <w:szCs w:val="24"/>
+        </w:rPr>
+        <w:t xml:space="preserve"> </w:t>
+      </w:r>
+      <w:r>
+        <w:rPr>
+          <w:b/>
+          <w:bCs/>
+          <w:sz w:val="24"/>
+          <w:szCs w:val="24"/>
+        </w:rPr>
         <w:t xml:space="preserve">HarnessTax</w:t>
       </w:r>
       <w:r>
@@ -3764,6 +4214,68 @@
           <w:szCs w:val="24"/>
         </w:rPr>
         <w:t xml:space="preserve">: how much does the harness matter for coding agents? 2026. Publicação de blogue de pesquisa, não revisada por pares. Disponível em: https://harnesstax.github.io/. Acesso em: 23 set. 2026.</w:t>
+      </w:r>
+    </w:p>
+    <w:p>
+      <w:pPr>
+        <w:spacing w:before="120" w:after="120" w:line="240" w:lineRule="auto"/>
+        <w:ind w:left="0" w:firstLine="0"/>
+        <w:jc w:val="left"/>
+      </w:pPr>
+      <w:r>
+        <w:rPr>
+          <w:sz w:val="24"/>
+          <w:szCs w:val="24"/>
+        </w:rPr>
+        <w:t xml:space="preserve">WONG, Sherman </w:t>
+      </w:r>
+      <w:r>
+        <w:rPr>
+          <w:i/>
+          <w:iCs/>
+          <w:sz w:val="24"/>
+          <w:szCs w:val="24"/>
+        </w:rPr>
+        <w:t xml:space="preserve">et al.</w:t>
+      </w:r>
+      <w:r>
+        <w:rPr>
+          <w:sz w:val="24"/>
+          <w:szCs w:val="24"/>
+        </w:rPr>
+        <w:t xml:space="preserve"> </w:t>
+      </w:r>
+      <w:r>
+        <w:rPr>
+          <w:b/>
+          <w:bCs/>
+          <w:sz w:val="24"/>
+          <w:szCs w:val="24"/>
+        </w:rPr>
+        <w:t xml:space="preserve">Confucius Code Agent</w:t>
+      </w:r>
+      <w:r>
+        <w:rPr>
+          <w:sz w:val="24"/>
+          <w:szCs w:val="24"/>
+        </w:rPr>
+        <w:t xml:space="preserve">: scalable agent scaffolding for real-world codebases. arXiv:2512.10398, 2025. </w:t>
+      </w:r>
+      <w:r>
+        <w:rPr>
+          <w:i/>
+          <w:iCs/>
+          <w:sz w:val="24"/>
+          <w:szCs w:val="24"/>
+        </w:rPr>
+        <w:t xml:space="preserve">Preprint</w:t>
+      </w:r>
+      <w:r>
+        <w:rPr>
+          <w:sz w:val="24"/>
+          <w:szCs w:val="24"/>
+        </w:rPr>
+        <w:t xml:space="preserve">, não revisado por pares. Disponível em: https://arxiv.org/abs/2512.10398. Acesso em: 22 out. 2026.</w:t>
       </w:r>
     </w:p>
     <w:p>
@@ -4048,7 +4560,7 @@
           <w:sz w:val="20"/>
           <w:szCs w:val="20"/>
         </w:rPr>
-        <w:t xml:space="preserve"> Professora orientadora – Departamento de Área de Informática – Instituto Federal de Educação, Ciência e Tecnologia de Mato Grosso – Campus Cuiabá Cel. Octayde Jorge da Silva.</w:t>
+        <w:t xml:space="preserve"> Professora orientadora – Departamento de Área de Informática – Instituto Federal de Educação, Ciência e Tecnologia de Mato Grosso – Campus Cuiabá Cel. Octayde Jorge da Silva. inara.ferrer@ifmt.edu.br</w:t>
       </w:r>
     </w:p>
   </w:footnote>

</xml_diff>

<commit_message>
docs(artigo): cite HERMES on harness cost with the model fixed
Jin et al. (2026, UIUC and Penn State) report SWE-bench Verified resolution and cost per task for mini-SWE-agent and HERMES under the same backbone. Of the five preprints the author asked to review, the other four are not about coding-agent harnesses and stay out; reasons are in log.md. Word: 9 pages; 21 entries, 21 cited.
</commit_message>
<xml_diff>
--- a/dist/artigo-cientifico.docx
+++ b/dist/artigo-cientifico.docx
@@ -1263,7 +1263,23 @@
           <w:sz w:val="24"/>
           <w:szCs w:val="24"/>
         </w:rPr>
-        <w:t xml:space="preserve"> sobre a taxa de sucesso ficou dentro de ±2%, enquanto o Claude Code custou, em média, cerca de 2,0 vezes o Pi.</w:t>
+        <w:t xml:space="preserve"> sobre a taxa de sucesso ficou dentro de ±2%, enquanto o Claude Code custou, em média, cerca de 2,0 vezes o Pi. Em Jin </w:t>
+      </w:r>
+      <w:r>
+        <w:rPr>
+          <w:i/>
+          <w:iCs/>
+          <w:sz w:val="24"/>
+          <w:szCs w:val="24"/>
+        </w:rPr>
+        <w:t xml:space="preserve">et al.</w:t>
+      </w:r>
+      <w:r>
+        <w:rPr>
+          <w:sz w:val="24"/>
+          <w:szCs w:val="24"/>
+        </w:rPr>
+        <w:t xml:space="preserve"> (2026), no SWE-bench Verified de 500 tarefas, trocar o mini-SWE-agent pelo HERMES, com o GPT-5.6 Sol, levou a resolução de 96,20% para 97,00% e o custo por tarefa de US$ 1,15 para US$ 1,80. Com o GPT-5 Mini, a resolução subiu de 60,80% para 80,20%.</w:t>
       </w:r>
     </w:p>
     <w:p>
@@ -3719,6 +3735,68 @@
           <w:sz w:val="24"/>
           <w:szCs w:val="24"/>
         </w:rPr>
+        <w:t xml:space="preserve">JIN, Haibo </w:t>
+      </w:r>
+      <w:r>
+        <w:rPr>
+          <w:i/>
+          <w:iCs/>
+          <w:sz w:val="24"/>
+          <w:szCs w:val="24"/>
+        </w:rPr>
+        <w:t xml:space="preserve">et al.</w:t>
+      </w:r>
+      <w:r>
+        <w:rPr>
+          <w:sz w:val="24"/>
+          <w:szCs w:val="24"/>
+        </w:rPr>
+        <w:t xml:space="preserve"> </w:t>
+      </w:r>
+      <w:r>
+        <w:rPr>
+          <w:b/>
+          <w:bCs/>
+          <w:sz w:val="24"/>
+          <w:szCs w:val="24"/>
+        </w:rPr>
+        <w:t xml:space="preserve">Harness engineering for software engineering via modular executable dev-primitives</w:t>
+      </w:r>
+      <w:r>
+        <w:rPr>
+          <w:sz w:val="24"/>
+          <w:szCs w:val="24"/>
+        </w:rPr>
+        <w:t xml:space="preserve">. arXiv:2610.07832, 2026. </w:t>
+      </w:r>
+      <w:r>
+        <w:rPr>
+          <w:i/>
+          <w:iCs/>
+          <w:sz w:val="24"/>
+          <w:szCs w:val="24"/>
+        </w:rPr>
+        <w:t xml:space="preserve">Preprint</w:t>
+      </w:r>
+      <w:r>
+        <w:rPr>
+          <w:sz w:val="24"/>
+          <w:szCs w:val="24"/>
+        </w:rPr>
+        <w:t xml:space="preserve">, não revisado por pares. Disponível em: https://arxiv.org/abs/2610.07832. Acesso em: 22 out. 2026.</w:t>
+      </w:r>
+    </w:p>
+    <w:p>
+      <w:pPr>
+        <w:spacing w:before="120" w:after="120" w:line="240" w:lineRule="auto"/>
+        <w:ind w:left="0" w:firstLine="0"/>
+        <w:jc w:val="left"/>
+      </w:pPr>
+      <w:r>
+        <w:rPr>
+          <w:sz w:val="24"/>
+          <w:szCs w:val="24"/>
+        </w:rPr>
         <w:t xml:space="preserve">KARPATHY, Andrej. </w:t>
       </w:r>
       <w:r>

</xml_diff>